<commit_message>
Update report and file names
</commit_message>
<xml_diff>
--- a/Predictive_Analytics_Report.docx
+++ b/Predictive_Analytics_Report.docx
@@ -65,6 +65,7 @@
         <w:jc w:val="center"/>
         <w:rPr>
           <w:rFonts w:ascii="Times New Roman" w:hAnsi="Times New Roman" w:cs="Times New Roman"/>
+          <w:sz w:val="26"/>
         </w:rPr>
       </w:pPr>
       <w:r>
@@ -82,6 +83,45 @@
         <w:br/>
         <w:t>Using the CDC BRFSS 2015 Dataset</w:t>
       </w:r>
+    </w:p>
+    <w:p>
+      <w:pPr>
+        <w:jc w:val="center"/>
+        <w:rPr>
+          <w:rFonts w:ascii="Times New Roman" w:hAnsi="Times New Roman" w:cs="Times New Roman"/>
+          <w:sz w:val="24"/>
+          <w:szCs w:val="24"/>
+        </w:rPr>
+      </w:pPr>
+      <w:r>
+        <w:rPr>
+          <w:rFonts w:ascii="Times New Roman" w:hAnsi="Times New Roman" w:cs="Times New Roman"/>
+          <w:b/>
+          <w:bCs/>
+          <w:sz w:val="24"/>
+          <w:szCs w:val="24"/>
+        </w:rPr>
+        <w:t>Code Repository:</w:t>
+      </w:r>
+      <w:r>
+        <w:rPr>
+          <w:rFonts w:ascii="Times New Roman" w:hAnsi="Times New Roman" w:cs="Times New Roman"/>
+          <w:sz w:val="24"/>
+          <w:szCs w:val="24"/>
+        </w:rPr>
+        <w:t xml:space="preserve"> </w:t>
+      </w:r>
+      <w:hyperlink r:id="rId8" w:history="1">
+        <w:r>
+          <w:rPr>
+            <w:rStyle w:val="Hyperlink"/>
+            <w:rFonts w:ascii="Times New Roman" w:hAnsi="Times New Roman" w:cs="Times New Roman"/>
+            <w:sz w:val="24"/>
+            <w:szCs w:val="24"/>
+          </w:rPr>
+          <w:t>Diabetes Prediction Report</w:t>
+        </w:r>
+      </w:hyperlink>
     </w:p>
     <w:p>
       <w:pPr>
@@ -437,7 +477,7 @@
                     <pic:cNvPicPr/>
                   </pic:nvPicPr>
                   <pic:blipFill>
-                    <a:blip r:embed="rId6"/>
+                    <a:blip r:embed="rId9"/>
                     <a:stretch>
                       <a:fillRect/>
                     </a:stretch>
@@ -566,7 +606,7 @@
                     <pic:cNvPicPr/>
                   </pic:nvPicPr>
                   <pic:blipFill>
-                    <a:blip r:embed="rId7"/>
+                    <a:blip r:embed="rId10"/>
                     <a:stretch>
                       <a:fillRect/>
                     </a:stretch>
@@ -625,7 +665,31 @@
           <w:szCs w:val="22"/>
         </w:rPr>
         <w:lastRenderedPageBreak/>
-        <w:t xml:space="preserve">Figure 2 shows noticeable differences in the distributions of several features between the diabetic and non-diabetic groups. BMI, for example, is clearly shifted to the right for individuals with diabetes, with a mode around 30–35 compared to 25–28 for non-diabetics. This aligns with the well-established relationship between obesity and diabetes. </w:t>
+        <w:t xml:space="preserve">Figure 2 shows noticeable differences in the distributions of several features between </w:t>
+      </w:r>
+      <w:proofErr w:type="gramStart"/>
+      <w:r>
+        <w:rPr>
+          <w:rFonts w:ascii="Times New Roman" w:eastAsiaTheme="minorEastAsia" w:hAnsi="Times New Roman" w:cs="Times New Roman"/>
+          <w:b w:val="0"/>
+          <w:bCs w:val="0"/>
+          <w:color w:val="auto"/>
+          <w:sz w:val="22"/>
+          <w:szCs w:val="22"/>
+        </w:rPr>
+        <w:t>the diabetic</w:t>
+      </w:r>
+      <w:proofErr w:type="gramEnd"/>
+      <w:r>
+        <w:rPr>
+          <w:rFonts w:ascii="Times New Roman" w:eastAsiaTheme="minorEastAsia" w:hAnsi="Times New Roman" w:cs="Times New Roman"/>
+          <w:b w:val="0"/>
+          <w:bCs w:val="0"/>
+          <w:color w:val="auto"/>
+          <w:sz w:val="22"/>
+          <w:szCs w:val="22"/>
+        </w:rPr>
+        <w:t xml:space="preserve"> and non-diabetic groups. BMI, for example, is clearly shifted to the right for individuals with diabetes, with a mode around 30–35 compared to 25–28 for non-diabetics. This aligns with the well-established relationship between obesity and diabetes. </w:t>
       </w:r>
       <w:proofErr w:type="spellStart"/>
       <w:r>
@@ -792,7 +856,7 @@
                     <pic:cNvPicPr/>
                   </pic:nvPicPr>
                   <pic:blipFill>
-                    <a:blip r:embed="rId8"/>
+                    <a:blip r:embed="rId11"/>
                     <a:stretch>
                       <a:fillRect/>
                     </a:stretch>
@@ -1029,7 +1093,7 @@
                     <pic:cNvPicPr/>
                   </pic:nvPicPr>
                   <pic:blipFill>
-                    <a:blip r:embed="rId9"/>
+                    <a:blip r:embed="rId12"/>
                     <a:stretch>
                       <a:fillRect/>
                     </a:stretch>
@@ -1095,7 +1159,7 @@
                     <pic:cNvPicPr/>
                   </pic:nvPicPr>
                   <pic:blipFill>
-                    <a:blip r:embed="rId10"/>
+                    <a:blip r:embed="rId13"/>
                     <a:stretch>
                       <a:fillRect/>
                     </a:stretch>
@@ -1155,7 +1219,31 @@
           <w:szCs w:val="22"/>
         </w:rPr>
         <w:lastRenderedPageBreak/>
-        <w:t xml:space="preserve">The correlation matrix (Figure 4) shows that no pairwise correlations exceed 0.52, suggesting that severe multicollinearity is not present in the dataset. The strongest relationships between features appear between </w:t>
+        <w:t xml:space="preserve">The correlation matrix (Figure 4) shows that </w:t>
+      </w:r>
+      <w:proofErr w:type="gramStart"/>
+      <w:r>
+        <w:rPr>
+          <w:rFonts w:ascii="Times New Roman" w:eastAsiaTheme="minorEastAsia" w:hAnsi="Times New Roman" w:cs="Times New Roman"/>
+          <w:b w:val="0"/>
+          <w:bCs w:val="0"/>
+          <w:color w:val="auto"/>
+          <w:sz w:val="22"/>
+          <w:szCs w:val="22"/>
+        </w:rPr>
+        <w:t>no</w:t>
+      </w:r>
+      <w:proofErr w:type="gramEnd"/>
+      <w:r>
+        <w:rPr>
+          <w:rFonts w:ascii="Times New Roman" w:eastAsiaTheme="minorEastAsia" w:hAnsi="Times New Roman" w:cs="Times New Roman"/>
+          <w:b w:val="0"/>
+          <w:bCs w:val="0"/>
+          <w:color w:val="auto"/>
+          <w:sz w:val="22"/>
+          <w:szCs w:val="22"/>
+        </w:rPr>
+        <w:t xml:space="preserve"> pairwise correlations exceed 0.52, suggesting that severe multicollinearity is not present in the dataset. The strongest relationships between features appear between </w:t>
       </w:r>
       <w:proofErr w:type="spellStart"/>
       <w:r>
@@ -1491,7 +1579,7 @@
                     <pic:cNvPicPr/>
                   </pic:nvPicPr>
                   <pic:blipFill>
-                    <a:blip r:embed="rId11"/>
+                    <a:blip r:embed="rId14"/>
                     <a:stretch>
                       <a:fillRect/>
                     </a:stretch>
@@ -1542,7 +1630,21 @@
         <w:rPr>
           <w:rFonts w:ascii="Times New Roman" w:hAnsi="Times New Roman" w:cs="Times New Roman"/>
         </w:rPr>
-        <w:t>Figure 6 shows that the diabetic group has a higher median BMI of around 31, which falls in the obese range, compared to about 27 for the non-diabetic group, which is considered overweight. Both groups also contain extreme outliers, with BMI values reaching as high as 95–98. In total, 805 observations (0.32%) exceed a BMI of 60.</w:t>
+        <w:t xml:space="preserve">Figure 6 shows that the diabetic group has a higher median BMI of around 31, which falls in the obese range, compared to about 27 for the non-diabetic group, which is considered overweight. Both groups also contain extreme outliers, with BMI values reaching as high as 95–98. In total, 805 observations (0.32%) </w:t>
+      </w:r>
+      <w:proofErr w:type="gramStart"/>
+      <w:r>
+        <w:rPr>
+          <w:rFonts w:ascii="Times New Roman" w:hAnsi="Times New Roman" w:cs="Times New Roman"/>
+        </w:rPr>
+        <w:t>exceed</w:t>
+      </w:r>
+      <w:proofErr w:type="gramEnd"/>
+      <w:r>
+        <w:rPr>
+          <w:rFonts w:ascii="Times New Roman" w:hAnsi="Times New Roman" w:cs="Times New Roman"/>
+        </w:rPr>
+        <w:t xml:space="preserve"> a BMI of 60.</w:t>
       </w:r>
       <w:r>
         <w:rPr>
@@ -1668,6 +1770,7 @@
         <w:t xml:space="preserve">BMI values were capped at the 99th percentile (49.0) based on the training data. A </w:t>
       </w:r>
       <w:proofErr w:type="spellStart"/>
+      <w:proofErr w:type="gramStart"/>
       <w:r>
         <w:rPr>
           <w:rFonts w:ascii="Times New Roman" w:eastAsiaTheme="minorEastAsia" w:hAnsi="Times New Roman" w:cs="Times New Roman"/>
@@ -1689,7 +1792,19 @@
           <w:sz w:val="22"/>
           <w:szCs w:val="22"/>
         </w:rPr>
-        <w:t xml:space="preserve"> was also fit only on the training set and then applied to the validation and test sets. To address class imbalance, SMOTE was applied exclusively to the training data, balancing both classes to 131,000 observations each. This pipeline ensured that neither scaling parameters nor synthetic samples introduced information from the validation or test data, preserving the integrity of the evaluation.</w:t>
+        <w:t xml:space="preserve"> was</w:t>
+      </w:r>
+      <w:proofErr w:type="gramEnd"/>
+      <w:r>
+        <w:rPr>
+          <w:rFonts w:ascii="Times New Roman" w:eastAsiaTheme="minorEastAsia" w:hAnsi="Times New Roman" w:cs="Times New Roman"/>
+          <w:b w:val="0"/>
+          <w:bCs w:val="0"/>
+          <w:color w:val="auto"/>
+          <w:sz w:val="22"/>
+          <w:szCs w:val="22"/>
+        </w:rPr>
+        <w:t xml:space="preserve"> also fit only on the training set and then applied to the validation and test sets. To address class imbalance, SMOTE was applied exclusively to the training data, balancing both classes to 131,000 observations each. This pipeline ensured that neither scaling parameters nor synthetic samples introduced information from the validation or test data, preserving the integrity of the evaluation.</w:t>
       </w:r>
     </w:p>
     <w:p>
@@ -2455,7 +2570,7 @@
                     <pic:cNvPicPr/>
                   </pic:nvPicPr>
                   <pic:blipFill>
-                    <a:blip r:embed="rId12"/>
+                    <a:blip r:embed="rId15"/>
                     <a:stretch>
                       <a:fillRect/>
                     </a:stretch>
@@ -2574,7 +2689,7 @@
                     <pic:cNvPicPr/>
                   </pic:nvPicPr>
                   <pic:blipFill>
-                    <a:blip r:embed="rId13"/>
+                    <a:blip r:embed="rId16"/>
                     <a:stretch>
                       <a:fillRect/>
                     </a:stretch>
@@ -2697,7 +2812,23 @@
           <w:rFonts w:ascii="Times New Roman" w:hAnsi="Times New Roman" w:cs="Times New Roman"/>
           <w:color w:val="auto"/>
         </w:rPr>
-        <w:t>5. Fine-Tuning &amp; Evaluation</w:t>
+        <w:t xml:space="preserve">5. </w:t>
+      </w:r>
+      <w:proofErr w:type="gramStart"/>
+      <w:r>
+        <w:rPr>
+          <w:rFonts w:ascii="Times New Roman" w:hAnsi="Times New Roman" w:cs="Times New Roman"/>
+          <w:color w:val="auto"/>
+        </w:rPr>
+        <w:t>Fine-Tuning</w:t>
+      </w:r>
+      <w:proofErr w:type="gramEnd"/>
+      <w:r>
+        <w:rPr>
+          <w:rFonts w:ascii="Times New Roman" w:hAnsi="Times New Roman" w:cs="Times New Roman"/>
+          <w:color w:val="auto"/>
+        </w:rPr>
+        <w:t xml:space="preserve"> &amp; Evaluation</w:t>
       </w:r>
     </w:p>
     <w:p>
@@ -2940,7 +3071,7 @@
                     <pic:cNvPicPr/>
                   </pic:nvPicPr>
                   <pic:blipFill>
-                    <a:blip r:embed="rId14"/>
+                    <a:blip r:embed="rId17"/>
                     <a:stretch>
                       <a:fillRect/>
                     </a:stretch>
@@ -3006,7 +3137,7 @@
                     <pic:cNvPicPr/>
                   </pic:nvPicPr>
                   <pic:blipFill>
-                    <a:blip r:embed="rId15"/>
+                    <a:blip r:embed="rId18"/>
                     <a:stretch>
                       <a:fillRect/>
                     </a:stretch>
@@ -3108,7 +3239,7 @@
                     <pic:cNvPicPr/>
                   </pic:nvPicPr>
                   <pic:blipFill>
-                    <a:blip r:embed="rId16"/>
+                    <a:blip r:embed="rId19"/>
                     <a:stretch>
                       <a:fillRect/>
                     </a:stretch>
@@ -3190,7 +3321,7 @@
                     <pic:cNvPicPr/>
                   </pic:nvPicPr>
                   <pic:blipFill>
-                    <a:blip r:embed="rId17"/>
+                    <a:blip r:embed="rId20"/>
                     <a:stretch>
                       <a:fillRect/>
                     </a:stretch>
@@ -3393,7 +3524,7 @@
                     <pic:cNvPicPr/>
                   </pic:nvPicPr>
                   <pic:blipFill>
-                    <a:blip r:embed="rId18"/>
+                    <a:blip r:embed="rId21"/>
                     <a:stretch>
                       <a:fillRect/>
                     </a:stretch>
@@ -3840,6 +3971,8 @@
         <w:jc w:val="center"/>
         <w:rPr>
           <w:rFonts w:ascii="Times New Roman" w:hAnsi="Times New Roman" w:cs="Times New Roman"/>
+          <w:i/>
+          <w:sz w:val="18"/>
         </w:rPr>
       </w:pPr>
       <w:r>
@@ -4419,12 +4552,16 @@
         <w:ind w:left="720" w:hanging="720"/>
         <w:rPr>
           <w:rFonts w:ascii="Times New Roman" w:hAnsi="Times New Roman" w:cs="Times New Roman"/>
+          <w:sz w:val="28"/>
+          <w:szCs w:val="28"/>
         </w:rPr>
       </w:pPr>
       <w:r>
         <w:rPr>
           <w:rFonts w:ascii="Times New Roman" w:hAnsi="Times New Roman" w:cs="Times New Roman"/>
           <w:b/>
+          <w:sz w:val="28"/>
+          <w:szCs w:val="28"/>
         </w:rPr>
         <w:lastRenderedPageBreak/>
         <w:t>Appendix: Agent Usage Log + Decision Register</w:t>
@@ -4436,6 +4573,8 @@
         <w:ind w:left="720" w:hanging="720"/>
         <w:rPr>
           <w:rFonts w:ascii="Times New Roman" w:hAnsi="Times New Roman" w:cs="Times New Roman"/>
+          <w:sz w:val="28"/>
+          <w:szCs w:val="28"/>
         </w:rPr>
       </w:pPr>
     </w:p>
@@ -4544,6 +4683,8 @@
           <w:rFonts w:ascii="Times New Roman" w:hAnsi="Times New Roman" w:cs="Times New Roman"/>
           <w:b/>
           <w:bCs/>
+          <w:sz w:val="24"/>
+          <w:szCs w:val="24"/>
         </w:rPr>
       </w:pPr>
       <w:r>
@@ -4551,6 +4692,8 @@
           <w:rFonts w:ascii="Times New Roman" w:hAnsi="Times New Roman" w:cs="Times New Roman"/>
           <w:b/>
           <w:bCs/>
+          <w:sz w:val="24"/>
+          <w:szCs w:val="24"/>
         </w:rPr>
         <w:t>Interaction Log</w:t>
       </w:r>
@@ -4724,6 +4867,7 @@
         <w:t xml:space="preserve"> is in </w:t>
       </w:r>
       <w:proofErr w:type="spellStart"/>
+      <w:proofErr w:type="gramStart"/>
       <w:r>
         <w:rPr>
           <w:rFonts w:ascii="Times New Roman" w:hAnsi="Times New Roman" w:cs="Times New Roman"/>
@@ -4731,6 +4875,7 @@
         <w:t>sklearn.calibration</w:t>
       </w:r>
       <w:proofErr w:type="spellEnd"/>
+      <w:proofErr w:type="gramEnd"/>
       <w:r>
         <w:rPr>
           <w:rFonts w:ascii="Times New Roman" w:hAnsi="Times New Roman" w:cs="Times New Roman"/>
@@ -4738,6 +4883,7 @@
         <w:t xml:space="preserve">, not </w:t>
       </w:r>
       <w:proofErr w:type="spellStart"/>
+      <w:proofErr w:type="gramStart"/>
       <w:r>
         <w:rPr>
           <w:rFonts w:ascii="Times New Roman" w:hAnsi="Times New Roman" w:cs="Times New Roman"/>
@@ -4745,6 +4891,7 @@
         <w:t>sklearn.metrics</w:t>
       </w:r>
       <w:proofErr w:type="spellEnd"/>
+      <w:proofErr w:type="gramEnd"/>
       <w:r>
         <w:rPr>
           <w:rFonts w:ascii="Times New Roman" w:hAnsi="Times New Roman" w:cs="Times New Roman"/>
@@ -4788,18 +4935,40 @@
         <w:t>" in history keys. Agent’s dynamic key-finder had a case bug. I diagnosed via print(</w:t>
       </w:r>
       <w:proofErr w:type="spellStart"/>
-      <w:r>
-        <w:rPr>
-          <w:rFonts w:ascii="Times New Roman" w:hAnsi="Times New Roman" w:cs="Times New Roman"/>
-        </w:rPr>
-        <w:t>history.history.keys</w:t>
+      <w:proofErr w:type="gramStart"/>
+      <w:r>
+        <w:rPr>
+          <w:rFonts w:ascii="Times New Roman" w:hAnsi="Times New Roman" w:cs="Times New Roman"/>
+        </w:rPr>
+        <w:t>history.history</w:t>
+      </w:r>
+      <w:proofErr w:type="gramEnd"/>
+      <w:r>
+        <w:rPr>
+          <w:rFonts w:ascii="Times New Roman" w:hAnsi="Times New Roman" w:cs="Times New Roman"/>
+        </w:rPr>
+        <w:t>.</w:t>
+      </w:r>
+      <w:proofErr w:type="gramStart"/>
+      <w:r>
+        <w:rPr>
+          <w:rFonts w:ascii="Times New Roman" w:hAnsi="Times New Roman" w:cs="Times New Roman"/>
+        </w:rPr>
+        <w:t>keys</w:t>
       </w:r>
       <w:proofErr w:type="spellEnd"/>
       <w:r>
         <w:rPr>
           <w:rFonts w:ascii="Times New Roman" w:hAnsi="Times New Roman" w:cs="Times New Roman"/>
         </w:rPr>
-        <w:t>()) and agent provided correct fix. Modified.</w:t>
+        <w:t>(</w:t>
+      </w:r>
+      <w:proofErr w:type="gramEnd"/>
+      <w:r>
+        <w:rPr>
+          <w:rFonts w:ascii="Times New Roman" w:hAnsi="Times New Roman" w:cs="Times New Roman"/>
+        </w:rPr>
+        <w:t>)) and agent provided correct fix. Modified.</w:t>
       </w:r>
     </w:p>
     <w:p>
@@ -5329,6 +5498,7 @@
               <w:t xml:space="preserve">, correlation values against </w:t>
             </w:r>
             <w:proofErr w:type="spellStart"/>
+            <w:proofErr w:type="gramStart"/>
             <w:r>
               <w:rPr>
                 <w:rFonts w:ascii="Times New Roman" w:hAnsi="Times New Roman" w:cs="Times New Roman"/>
@@ -5336,6 +5506,7 @@
               <w:t>df.corr</w:t>
             </w:r>
             <w:proofErr w:type="spellEnd"/>
+            <w:proofErr w:type="gramEnd"/>
             <w:r>
               <w:rPr>
                 <w:rFonts w:ascii="Times New Roman" w:hAnsi="Times New Roman" w:cs="Times New Roman"/>
@@ -5735,7 +5906,21 @@
               <w:rPr>
                 <w:rFonts w:ascii="Times New Roman" w:hAnsi="Times New Roman" w:cs="Times New Roman"/>
               </w:rPr>
-              <w:t>Identified data leakage: scaler learns test statistics, SMOTE creates cross-split overlap.</w:t>
+              <w:t xml:space="preserve">Identified data leakage: </w:t>
+            </w:r>
+            <w:proofErr w:type="gramStart"/>
+            <w:r>
+              <w:rPr>
+                <w:rFonts w:ascii="Times New Roman" w:hAnsi="Times New Roman" w:cs="Times New Roman"/>
+              </w:rPr>
+              <w:t>scaler</w:t>
+            </w:r>
+            <w:proofErr w:type="gramEnd"/>
+            <w:r>
+              <w:rPr>
+                <w:rFonts w:ascii="Times New Roman" w:hAnsi="Times New Roman" w:cs="Times New Roman"/>
+              </w:rPr>
+              <w:t xml:space="preserve"> learns test statistics, SMOTE creates cross-split overlap.</w:t>
             </w:r>
           </w:p>
         </w:tc>
@@ -6239,11 +6424,19 @@
                 <w:rFonts w:ascii="Times New Roman" w:hAnsi="Times New Roman" w:cs="Times New Roman"/>
               </w:rPr>
             </w:pPr>
-            <w:r>
-              <w:rPr>
-                <w:rFonts w:ascii="Times New Roman" w:hAnsi="Times New Roman" w:cs="Times New Roman"/>
-              </w:rPr>
-              <w:t xml:space="preserve">128→64→32→1 with </w:t>
+            <w:proofErr w:type="gramStart"/>
+            <w:r>
+              <w:rPr>
+                <w:rFonts w:ascii="Times New Roman" w:hAnsi="Times New Roman" w:cs="Times New Roman"/>
+              </w:rPr>
+              <w:t>128→64→32→1</w:t>
+            </w:r>
+            <w:proofErr w:type="gramEnd"/>
+            <w:r>
+              <w:rPr>
+                <w:rFonts w:ascii="Times New Roman" w:hAnsi="Times New Roman" w:cs="Times New Roman"/>
+              </w:rPr>
+              <w:t xml:space="preserve"> with </w:t>
             </w:r>
             <w:proofErr w:type="spellStart"/>
             <w:r>
@@ -6257,7 +6450,21 @@
               <w:rPr>
                 <w:rFonts w:ascii="Times New Roman" w:hAnsi="Times New Roman" w:cs="Times New Roman"/>
               </w:rPr>
-              <w:t>, Dropout(0.3/0.2), Adam, early stopping.</w:t>
+              <w:t xml:space="preserve">, </w:t>
+            </w:r>
+            <w:proofErr w:type="gramStart"/>
+            <w:r>
+              <w:rPr>
+                <w:rFonts w:ascii="Times New Roman" w:hAnsi="Times New Roman" w:cs="Times New Roman"/>
+              </w:rPr>
+              <w:t>Dropout(</w:t>
+            </w:r>
+            <w:proofErr w:type="gramEnd"/>
+            <w:r>
+              <w:rPr>
+                <w:rFonts w:ascii="Times New Roman" w:hAnsi="Times New Roman" w:cs="Times New Roman"/>
+              </w:rPr>
+              <w:t>0.3/0.2), Adam, early stopping.</w:t>
             </w:r>
           </w:p>
         </w:tc>
@@ -6422,7 +6629,21 @@
               <w:rPr>
                 <w:rFonts w:ascii="Times New Roman" w:hAnsi="Times New Roman" w:cs="Times New Roman"/>
               </w:rPr>
-              <w:t>Diagnosed both via runtime errors. Fixed import path; diagnosed key name via print().</w:t>
+              <w:t xml:space="preserve">Diagnosed both via runtime errors. Fixed import path; diagnosed key name via </w:t>
+            </w:r>
+            <w:proofErr w:type="gramStart"/>
+            <w:r>
+              <w:rPr>
+                <w:rFonts w:ascii="Times New Roman" w:hAnsi="Times New Roman" w:cs="Times New Roman"/>
+              </w:rPr>
+              <w:t>print(</w:t>
+            </w:r>
+            <w:proofErr w:type="gramEnd"/>
+            <w:r>
+              <w:rPr>
+                <w:rFonts w:ascii="Times New Roman" w:hAnsi="Times New Roman" w:cs="Times New Roman"/>
+              </w:rPr>
+              <w:t>).</w:t>
             </w:r>
           </w:p>
         </w:tc>
@@ -6689,6 +6910,7 @@
               </w:rPr>
             </w:pPr>
             <w:proofErr w:type="spellStart"/>
+            <w:proofErr w:type="gramStart"/>
             <w:r>
               <w:rPr>
                 <w:rFonts w:ascii="Times New Roman" w:hAnsi="Times New Roman" w:cs="Times New Roman"/>
@@ -6696,11 +6918,26 @@
               <w:t>TreeExplainer</w:t>
             </w:r>
             <w:proofErr w:type="spellEnd"/>
-            <w:r>
-              <w:rPr>
-                <w:rFonts w:ascii="Times New Roman" w:hAnsi="Times New Roman" w:cs="Times New Roman"/>
-              </w:rPr>
-              <w:t xml:space="preserve"> on 1,000-sample test subset. Summary + bar plots.</w:t>
+            <w:proofErr w:type="gramEnd"/>
+            <w:r>
+              <w:rPr>
+                <w:rFonts w:ascii="Times New Roman" w:hAnsi="Times New Roman" w:cs="Times New Roman"/>
+              </w:rPr>
+              <w:t xml:space="preserve"> on </w:t>
+            </w:r>
+            <w:proofErr w:type="gramStart"/>
+            <w:r>
+              <w:rPr>
+                <w:rFonts w:ascii="Times New Roman" w:hAnsi="Times New Roman" w:cs="Times New Roman"/>
+              </w:rPr>
+              <w:t>1,000-sample</w:t>
+            </w:r>
+            <w:proofErr w:type="gramEnd"/>
+            <w:r>
+              <w:rPr>
+                <w:rFonts w:ascii="Times New Roman" w:hAnsi="Times New Roman" w:cs="Times New Roman"/>
+              </w:rPr>
+              <w:t xml:space="preserve"> test subset. Summary + bar plots.</w:t>
             </w:r>
           </w:p>
         </w:tc>
@@ -7058,7 +7295,21 @@
               <w:rPr>
                 <w:rFonts w:ascii="Times New Roman" w:hAnsi="Times New Roman" w:cs="Times New Roman"/>
               </w:rPr>
-              <w:t>Compared against brief’s model card requirements. All elements present.</w:t>
+              <w:t xml:space="preserve">Compared against </w:t>
+            </w:r>
+            <w:proofErr w:type="gramStart"/>
+            <w:r>
+              <w:rPr>
+                <w:rFonts w:ascii="Times New Roman" w:hAnsi="Times New Roman" w:cs="Times New Roman"/>
+              </w:rPr>
+              <w:t>brief’s model</w:t>
+            </w:r>
+            <w:proofErr w:type="gramEnd"/>
+            <w:r>
+              <w:rPr>
+                <w:rFonts w:ascii="Times New Roman" w:hAnsi="Times New Roman" w:cs="Times New Roman"/>
+              </w:rPr>
+              <w:t xml:space="preserve"> card requirements. All elements present.</w:t>
             </w:r>
           </w:p>
         </w:tc>
@@ -7147,7 +7398,21 @@
               <w:rPr>
                 <w:rFonts w:ascii="Times New Roman" w:hAnsi="Times New Roman" w:cs="Times New Roman"/>
               </w:rPr>
-              <w:t>Generated ~1,800 word report with 13 figures, 2 tables, Harvard refs.</w:t>
+              <w:t>Generated ~</w:t>
+            </w:r>
+            <w:proofErr w:type="gramStart"/>
+            <w:r>
+              <w:rPr>
+                <w:rFonts w:ascii="Times New Roman" w:hAnsi="Times New Roman" w:cs="Times New Roman"/>
+              </w:rPr>
+              <w:t>1,800 word</w:t>
+            </w:r>
+            <w:proofErr w:type="gramEnd"/>
+            <w:r>
+              <w:rPr>
+                <w:rFonts w:ascii="Times New Roman" w:hAnsi="Times New Roman" w:cs="Times New Roman"/>
+              </w:rPr>
+              <w:t xml:space="preserve"> report with 13 figures, 2 tables, Harvard refs.</w:t>
             </w:r>
           </w:p>
         </w:tc>
@@ -7679,7 +7944,7 @@
                     <pic:cNvPicPr/>
                   </pic:nvPicPr>
                   <pic:blipFill>
-                    <a:blip r:embed="rId19"/>
+                    <a:blip r:embed="rId22"/>
                     <a:stretch>
                       <a:fillRect/>
                     </a:stretch>
@@ -7729,7 +7994,7 @@
                     <pic:cNvPicPr/>
                   </pic:nvPicPr>
                   <pic:blipFill>
-                    <a:blip r:embed="rId20"/>
+                    <a:blip r:embed="rId23"/>
                     <a:stretch>
                       <a:fillRect/>
                     </a:stretch>
@@ -7787,7 +8052,7 @@
                     <pic:cNvPicPr/>
                   </pic:nvPicPr>
                   <pic:blipFill>
-                    <a:blip r:embed="rId21"/>
+                    <a:blip r:embed="rId24"/>
                     <a:stretch>
                       <a:fillRect/>
                     </a:stretch>
@@ -7816,6 +8081,56 @@
     </w:sectPr>
   </w:body>
 </w:document>
+</file>
+
+<file path=word/endnotes.xml><?xml version="1.0" encoding="utf-8"?>
+<w:endnotes xmlns:wpc="http://schemas.microsoft.com/office/word/2010/wordprocessingCanvas" xmlns:cx="http://schemas.microsoft.com/office/drawing/2014/chartex" xmlns:cx1="http://schemas.microsoft.com/office/drawing/2015/9/8/chartex" xmlns:cx2="http://schemas.microsoft.com/office/drawing/2015/10/21/chartex" xmlns:cx3="http://schemas.microsoft.com/office/drawing/2016/5/9/chartex" xmlns:cx4="http://schemas.microsoft.com/office/drawing/2016/5/10/chartex" xmlns:cx5="http://schemas.microsoft.com/office/drawing/2016/5/11/chartex" xmlns:cx6="http://schemas.microsoft.com/office/drawing/2016/5/12/chartex" xmlns:cx7="http://schemas.microsoft.com/office/drawing/2016/5/13/chartex" xmlns:cx8="http://schemas.microsoft.com/office/drawing/2016/5/14/chartex" xmlns:mc="http://schemas.openxmlformats.org/markup-compatibility/2006" xmlns:aink="http://schemas.microsoft.com/office/drawing/2016/ink" xmlns:am3d="http://schemas.microsoft.com/office/drawing/2017/model3d" xmlns:o="urn:schemas-microsoft-com:office:office" xmlns:oel="http://schemas.microsoft.com/office/2019/extlst" xmlns:r="http://schemas.openxmlformats.org/officeDocument/2006/relationships" xmlns:m="http://schemas.openxmlformats.org/officeDocument/2006/math" xmlns:v="urn:schemas-microsoft-com:vml" xmlns:wp14="http://schemas.microsoft.com/office/word/2010/wordprocessingDrawing" xmlns:wp="http://schemas.openxmlformats.org/drawingml/2006/wordprocessingDrawing" xmlns:w10="urn:schemas-microsoft-com:office:word" xmlns:w="http://schemas.openxmlformats.org/wordprocessingml/2006/main" xmlns:w14="http://schemas.microsoft.com/office/word/2010/wordml" xmlns:w15="http://schemas.microsoft.com/office/word/2012/wordml" xmlns:w16cex="http://schemas.microsoft.com/office/word/2018/wordml/cex" xmlns:w16cid="http://schemas.microsoft.com/office/word/2016/wordml/cid" xmlns:w16="http://schemas.microsoft.com/office/word/2018/wordml" xmlns:w16du="http://schemas.microsoft.com/office/word/2023/wordml/word16du" xmlns:w16sdtdh="http://schemas.microsoft.com/office/word/2020/wordml/sdtdatahash" xmlns:w16sdtfl="http://schemas.microsoft.com/office/word/2024/wordml/sdtformatlock" xmlns:w16se="http://schemas.microsoft.com/office/word/2015/wordml/symex" xmlns:wpg="http://schemas.microsoft.com/office/word/2010/wordprocessingGroup" xmlns:wpi="http://schemas.microsoft.com/office/word/2010/wordprocessingInk" xmlns:wne="http://schemas.microsoft.com/office/word/2006/wordml" xmlns:wps="http://schemas.microsoft.com/office/word/2010/wordprocessingShape" mc:Ignorable="w14 w15 w16se w16cid w16 w16cex w16sdtdh w16sdtfl w16du wp14">
+  <w:endnote w:type="separator" w:id="-1">
+    <w:p>
+      <w:pPr>
+        <w:spacing w:after="0" w:line="240" w:lineRule="auto"/>
+      </w:pPr>
+      <w:r>
+        <w:separator/>
+      </w:r>
+    </w:p>
+  </w:endnote>
+  <w:endnote w:type="continuationSeparator" w:id="0">
+    <w:p>
+      <w:pPr>
+        <w:spacing w:after="0" w:line="240" w:lineRule="auto"/>
+      </w:pPr>
+      <w:r>
+        <w:continuationSeparator/>
+      </w:r>
+    </w:p>
+  </w:endnote>
+</w:endnotes>
+</file>
+
+<file path=word/footnotes.xml><?xml version="1.0" encoding="utf-8"?>
+<w:footnotes xmlns:wpc="http://schemas.microsoft.com/office/word/2010/wordprocessingCanvas" xmlns:cx="http://schemas.microsoft.com/office/drawing/2014/chartex" xmlns:cx1="http://schemas.microsoft.com/office/drawing/2015/9/8/chartex" xmlns:cx2="http://schemas.microsoft.com/office/drawing/2015/10/21/chartex" xmlns:cx3="http://schemas.microsoft.com/office/drawing/2016/5/9/chartex" xmlns:cx4="http://schemas.microsoft.com/office/drawing/2016/5/10/chartex" xmlns:cx5="http://schemas.microsoft.com/office/drawing/2016/5/11/chartex" xmlns:cx6="http://schemas.microsoft.com/office/drawing/2016/5/12/chartex" xmlns:cx7="http://schemas.microsoft.com/office/drawing/2016/5/13/chartex" xmlns:cx8="http://schemas.microsoft.com/office/drawing/2016/5/14/chartex" xmlns:mc="http://schemas.openxmlformats.org/markup-compatibility/2006" xmlns:aink="http://schemas.microsoft.com/office/drawing/2016/ink" xmlns:am3d="http://schemas.microsoft.com/office/drawing/2017/model3d" xmlns:o="urn:schemas-microsoft-com:office:office" xmlns:oel="http://schemas.microsoft.com/office/2019/extlst" xmlns:r="http://schemas.openxmlformats.org/officeDocument/2006/relationships" xmlns:m="http://schemas.openxmlformats.org/officeDocument/2006/math" xmlns:v="urn:schemas-microsoft-com:vml" xmlns:wp14="http://schemas.microsoft.com/office/word/2010/wordprocessingDrawing" xmlns:wp="http://schemas.openxmlformats.org/drawingml/2006/wordprocessingDrawing" xmlns:w10="urn:schemas-microsoft-com:office:word" xmlns:w="http://schemas.openxmlformats.org/wordprocessingml/2006/main" xmlns:w14="http://schemas.microsoft.com/office/word/2010/wordml" xmlns:w15="http://schemas.microsoft.com/office/word/2012/wordml" xmlns:w16cex="http://schemas.microsoft.com/office/word/2018/wordml/cex" xmlns:w16cid="http://schemas.microsoft.com/office/word/2016/wordml/cid" xmlns:w16="http://schemas.microsoft.com/office/word/2018/wordml" xmlns:w16du="http://schemas.microsoft.com/office/word/2023/wordml/word16du" xmlns:w16sdtdh="http://schemas.microsoft.com/office/word/2020/wordml/sdtdatahash" xmlns:w16sdtfl="http://schemas.microsoft.com/office/word/2024/wordml/sdtformatlock" xmlns:w16se="http://schemas.microsoft.com/office/word/2015/wordml/symex" xmlns:wpg="http://schemas.microsoft.com/office/word/2010/wordprocessingGroup" xmlns:wpi="http://schemas.microsoft.com/office/word/2010/wordprocessingInk" xmlns:wne="http://schemas.microsoft.com/office/word/2006/wordml" xmlns:wps="http://schemas.microsoft.com/office/word/2010/wordprocessingShape" mc:Ignorable="w14 w15 w16se w16cid w16 w16cex w16sdtdh w16sdtfl w16du wp14">
+  <w:footnote w:type="separator" w:id="-1">
+    <w:p>
+      <w:pPr>
+        <w:spacing w:after="0" w:line="240" w:lineRule="auto"/>
+      </w:pPr>
+      <w:r>
+        <w:separator/>
+      </w:r>
+    </w:p>
+  </w:footnote>
+  <w:footnote w:type="continuationSeparator" w:id="0">
+    <w:p>
+      <w:pPr>
+        <w:spacing w:after="0" w:line="240" w:lineRule="auto"/>
+      </w:pPr>
+      <w:r>
+        <w:continuationSeparator/>
+      </w:r>
+    </w:p>
+  </w:footnote>
+</w:footnotes>
 </file>
 
 <file path=word/numbering.xml><?xml version="1.0" encoding="utf-8"?>
@@ -19397,6 +19712,41 @@
       </w:tcPr>
     </w:tblStylePr>
   </w:style>
+  <w:style w:type="character" w:styleId="Hyperlink">
+    <w:name w:val="Hyperlink"/>
+    <w:basedOn w:val="DefaultParagraphFont"/>
+    <w:uiPriority w:val="99"/>
+    <w:unhideWhenUsed/>
+    <w:rsid w:val="00416E8D"/>
+    <w:rPr>
+      <w:color w:val="0000FF" w:themeColor="hyperlink"/>
+      <w:u w:val="single"/>
+    </w:rPr>
+  </w:style>
+  <w:style w:type="character" w:styleId="UnresolvedMention">
+    <w:name w:val="Unresolved Mention"/>
+    <w:basedOn w:val="DefaultParagraphFont"/>
+    <w:uiPriority w:val="99"/>
+    <w:semiHidden/>
+    <w:unhideWhenUsed/>
+    <w:rsid w:val="00416E8D"/>
+    <w:rPr>
+      <w:color w:val="605E5C"/>
+      <w:shd w:val="clear" w:color="auto" w:fill="E1DFDD"/>
+    </w:rPr>
+  </w:style>
+  <w:style w:type="character" w:styleId="FollowedHyperlink">
+    <w:name w:val="FollowedHyperlink"/>
+    <w:basedOn w:val="DefaultParagraphFont"/>
+    <w:uiPriority w:val="99"/>
+    <w:semiHidden/>
+    <w:unhideWhenUsed/>
+    <w:rsid w:val="00FD126E"/>
+    <w:rPr>
+      <w:color w:val="800080" w:themeColor="followedHyperlink"/>
+      <w:u w:val="single"/>
+    </w:rPr>
+  </w:style>
 </w:styles>
 </file>
 

</xml_diff>